<commit_message>
Add Strategia brandbook oficial e notas de identidade visual; atualiza diagnostico com MIV confirmado
</commit_message>
<xml_diff>
--- a/strategia-sindicos/diagnostico-estrategico.docx
+++ b/strategia-sindicos/diagnostico-estrategico.docx
@@ -1300,10 +1300,19 @@
         <w:rPr>
           <w:b/>
         </w:rPr>
-        <w:t>Tom de voz:</w:t>
+        <w:t>Status:</w:t>
       </w:r>
       <w:r>
-        <w:t xml:space="preserve"> profissional, direto, com autoridade técnica — mas sem alarmismo. Educa antes de vender. Em conteúdos de storytelling (condomínio insatisfeito), tom mais próximo e identificável, sem perder a seriedade institucional.</w:t>
+        <w:t xml:space="preserve"> MIV formal já existe (brandbook 2025, oficial) e </w:t>
+      </w:r>
+      <w:r>
+        <w:rPr>
+          <w:b/>
+        </w:rPr>
+        <w:t>a usuária decidiu manter a identidade visual atual como está</w:t>
+      </w:r>
+      <w:r>
+        <w:t xml:space="preserve"> — sem retrabalho de marca. Detalhamento completo em [`identidade-visual.md`](./identidade-visual.md) e o brandbook original em [`Brandbook-Strategia-Sindicos.pdf`](./Brandbook-Strategia-Sindicos.pdf), ambos nesta pasta.</w:t>
       </w:r>
     </w:p>
     <w:p>
@@ -1311,10 +1320,81 @@
         <w:rPr>
           <w:b/>
         </w:rPr>
-        <w:t>Cores/símbolos de referência (observação preliminar do Instagram — confirmar com MIV formal):</w:t>
+        <w:t>Conceito central:</w:t>
       </w:r>
       <w:r>
-        <w:t xml:space="preserve"> azul-marinho escuro como base, branco, vermelho/laranja como cor de CTA ("LEIA A LEGENDA"), verde reservado para temas ESG/sustentabilidade. Padrão "quadradinho" (checkerboard) usado como moldura decorativa fina em bordas de foto/bloco de cor, ou preenchendo selos/badges (ex: "10 anos") — não deve ser usado como fundo principal de slide com texto corrido, sob risco de comprometer legibilidade.</w:t>
+        <w:t xml:space="preserve"> a marca inteira é construída sobre a metáfora do </w:t>
+      </w:r>
+      <w:r>
+        <w:rPr>
+          <w:b/>
+        </w:rPr>
+        <w:t>xadrez</w:t>
+      </w:r>
+      <w:r>
+        <w:t xml:space="preserve"> — "tabuleiro", "jogada", "peça", "jogo" — posicionando a gestão condominial como algo que exige método e antecipação, nunca impulso ou sorte. Arquétipo dominante </w:t>
+      </w:r>
+      <w:r>
+        <w:rPr>
+          <w:b/>
+        </w:rPr>
+        <w:t>Governante</w:t>
+      </w:r>
+      <w:r>
+        <w:t xml:space="preserve"> (poder, ordem, decisão firme) combinado com arquétipo secundário </w:t>
+      </w:r>
+      <w:r>
+        <w:rPr>
+          <w:b/>
+        </w:rPr>
+        <w:t>Cuidador</w:t>
+      </w:r>
+      <w:r>
+        <w:t xml:space="preserve"> (empatia, serviço, proteção). Premissa: "Governar com sabedoria."</w:t>
+      </w:r>
+    </w:p>
+    <w:p>
+      <w:r>
+        <w:rPr>
+          <w:b/>
+        </w:rPr>
+        <w:t>Tom de voz:</w:t>
+      </w:r>
+      <w:r>
+        <w:t xml:space="preserve"> profissional, direto, com autoridade técnica — mas sem alarmismo. Educa antes de vender. Diretrizes textuais formais do brandbook: 1ª pessoa do plural, parágrafos de 3-4 linhas, termos estrangeiros sem itálico, negrito para destacar pontos importantes. Em conteúdos de storytelling (condomínio insatisfeito, ago-set), tom pode ficar mais próximo e identificável, sem abandonar a autoridade — não precisa forçar a metáfora do xadrez em todo post.</w:t>
+      </w:r>
+    </w:p>
+    <w:p>
+      <w:r>
+        <w:rPr>
+          <w:b/>
+        </w:rPr>
+        <w:t>Cores oficiais:</w:t>
+      </w:r>
+      <w:r>
+        <w:t xml:space="preserve"> base em 5 tons de azul (Meia Noite `#011633`, Escuro `#001F4B`, Neutro `#05399C`, Médio `#0543CC`, Claro `#155DFD`) + complementares (Bege `#FFFDFA`, Laranja `#ED2F05` como cor de destaque/CTA, Cinza Escuro/Médio/Claro). O verde usado pontualmente em posts ESG no Instagram não é cor oficial da paleta — manter como extensão pontual, só para esse tema específico.</w:t>
+      </w:r>
+    </w:p>
+    <w:p>
+      <w:r>
+        <w:rPr>
+          <w:b/>
+        </w:rPr>
+        <w:t>Tipografia oficial:</w:t>
+      </w:r>
+      <w:r>
+        <w:t xml:space="preserve"> Neometric (principal — títulos/destaques) + Overpass (secundária — parágrafos, Google Font).</w:t>
+      </w:r>
+    </w:p>
+    <w:p>
+      <w:r>
+        <w:rPr>
+          <w:b/>
+        </w:rPr>
+        <w:t>Elemento "quadradinho":</w:t>
+      </w:r>
+      <w:r>
+        <w:t xml:space="preserve"> é uma das 4 variações oficiais de elemento de apoio do brandbook (bloco quadriculado grande, faixa fina, quadriculado sólido em selos/badges, e silhuetas de peças de xadrez). Regra de uso: moldura/borda fina em fotos ou blocos de cor, preenchimento de selos (ex: "10 anos"), ou acento decorativo de canto (inclusive rotado 45° em losango) — nunca como fundo de slide com texto corrido.</w:t>
       </w:r>
     </w:p>
     <w:p>
@@ -1325,7 +1405,32 @@
         <w:t>O que evitar:</w:t>
       </w:r>
       <w:r>
-        <w:t xml:space="preserve"> branding genérico sem gancho de conversão (o padrão da agência anterior); comunicação que exponha publicamente as fraquezas internas identificadas neste diagnóstico (desorganização, demora de retorno) — esses pontos orientam o cuidado interno da agência, não o discurso público da marca.</w:t>
+        <w:t xml:space="preserve"> distorcer/recolorir o logo, dissociar ícone do wordmark, logo claro em fundo claro ou escuro em fundo escuro (dont's formais do brandbook); branding genérico sem gancho de conversão (o padrão da agência anterior); comunicação que exponha publicamente as fraquezas internas identificadas neste diagnóstico (desorganização, demora de retorno) — esses pontos orientam o cuidado interno da agência, não o discurso público da marca.</w:t>
+      </w:r>
+    </w:p>
+    <w:p>
+      <w:pPr>
+        <w:pStyle w:val="Heading1"/>
+      </w:pPr>
+      <w:r>
+        <w:rPr>
+          <w:color w:val="16335C"/>
+        </w:rPr>
+        <w:t>11. Frente futura sinalizada (não executar agora)</w:t>
+      </w:r>
+    </w:p>
+    <w:p>
+      <w:r>
+        <w:t xml:space="preserve">A usuária confirmou interesse em, </w:t>
+      </w:r>
+      <w:r>
+        <w:rPr>
+          <w:b/>
+        </w:rPr>
+        <w:t>a partir de novembro de 2026</w:t>
+      </w:r>
+      <w:r>
+        <w:t>, avaliar uma frente comercial dedicada a construtoras e imobiliárias (LP separada, materiais de social media e/ou tráfego pago focados em parceria/indicação B2B2C) — conforme já sinalizado na seção 5 (Oportunidades) e 8 (Sugestão de upsell futuro) deste diagnóstico. Retomar esse ponto quando o funil atual (cliente final) estiver estável e validado.</w:t>
       </w:r>
     </w:p>
     <w:sectPr>

</xml_diff>